<commit_message>
docs: update root documentation and project readme
</commit_message>
<xml_diff>
--- a/backend/AI_Prompts.docx
+++ b/backend/AI_Prompts.docx
@@ -4055,6 +4055,374 @@
           <w:rFonts w:ascii="Consolas" w:hAnsi="Consolas"/>
         </w:rPr>
         <w:t>The ignored .chrome-smoke directory can remain; its cleanup does not block the assessment.</w:t>
+      </w:r>
+    </w:p>
+    <w:p/>
+    <w:p>
+      <w:pPr>
+        <w:pStyle w:val="Heading2"/>
+      </w:pPr>
+      <w:r>
+        <w:t>Follow-up input: mixed-validity batch (verbatim)</w:t>
+      </w:r>
+    </w:p>
+    <w:p/>
+    <w:p>
+      <w:r>
+        <w:rPr>
+          <w:rFonts w:ascii="Consolas" w:hAnsi="Consolas"/>
+        </w:rPr>
+        <w:t>[</w:t>
+      </w:r>
+    </w:p>
+    <w:p>
+      <w:r>
+        <w:rPr>
+          <w:rFonts w:ascii="Consolas" w:hAnsi="Consolas"/>
+        </w:rPr>
+        <w:t xml:space="preserve">  {</w:t>
+      </w:r>
+    </w:p>
+    <w:p>
+      <w:r>
+        <w:rPr>
+          <w:rFonts w:ascii="Consolas" w:hAnsi="Consolas"/>
+        </w:rPr>
+        <w:t xml:space="preserve">    "api_name": "HealthyAPI",</w:t>
+      </w:r>
+    </w:p>
+    <w:p>
+      <w:r>
+        <w:rPr>
+          <w:rFonts w:ascii="Consolas" w:hAnsi="Consolas"/>
+        </w:rPr>
+        <w:t xml:space="preserve">    "response_time_ms": 120,</w:t>
+      </w:r>
+    </w:p>
+    <w:p>
+      <w:r>
+        <w:rPr>
+          <w:rFonts w:ascii="Consolas" w:hAnsi="Consolas"/>
+        </w:rPr>
+        <w:t xml:space="preserve">    "status_code": 200,</w:t>
+      </w:r>
+    </w:p>
+    <w:p>
+      <w:r>
+        <w:rPr>
+          <w:rFonts w:ascii="Consolas" w:hAnsi="Consolas"/>
+        </w:rPr>
+        <w:t xml:space="preserve">    "records_returned": 5</w:t>
+      </w:r>
+    </w:p>
+    <w:p>
+      <w:r>
+        <w:rPr>
+          <w:rFonts w:ascii="Consolas" w:hAnsi="Consolas"/>
+        </w:rPr>
+        <w:t xml:space="preserve">  },</w:t>
+      </w:r>
+    </w:p>
+    <w:p>
+      <w:r>
+        <w:rPr>
+          <w:rFonts w:ascii="Consolas" w:hAnsi="Consolas"/>
+        </w:rPr>
+        <w:t xml:space="preserve">  {</w:t>
+      </w:r>
+    </w:p>
+    <w:p>
+      <w:r>
+        <w:rPr>
+          <w:rFonts w:ascii="Consolas" w:hAnsi="Consolas"/>
+        </w:rPr>
+        <w:t xml:space="preserve">    "api_name": "SlowAPI",</w:t>
+      </w:r>
+    </w:p>
+    <w:p>
+      <w:r>
+        <w:rPr>
+          <w:rFonts w:ascii="Consolas" w:hAnsi="Consolas"/>
+        </w:rPr>
+        <w:t xml:space="preserve">    "response_time_ms": 3500,</w:t>
+      </w:r>
+    </w:p>
+    <w:p>
+      <w:r>
+        <w:rPr>
+          <w:rFonts w:ascii="Consolas" w:hAnsi="Consolas"/>
+        </w:rPr>
+        <w:t xml:space="preserve">    "status_code": 200,</w:t>
+      </w:r>
+    </w:p>
+    <w:p>
+      <w:r>
+        <w:rPr>
+          <w:rFonts w:ascii="Consolas" w:hAnsi="Consolas"/>
+        </w:rPr>
+        <w:t xml:space="preserve">    "records_returned": 2</w:t>
+      </w:r>
+    </w:p>
+    <w:p>
+      <w:r>
+        <w:rPr>
+          <w:rFonts w:ascii="Consolas" w:hAnsi="Consolas"/>
+        </w:rPr>
+        <w:t xml:space="preserve">  },</w:t>
+      </w:r>
+    </w:p>
+    <w:p>
+      <w:r>
+        <w:rPr>
+          <w:rFonts w:ascii="Consolas" w:hAnsi="Consolas"/>
+        </w:rPr>
+        <w:t xml:space="preserve">  {</w:t>
+      </w:r>
+    </w:p>
+    <w:p>
+      <w:r>
+        <w:rPr>
+          <w:rFonts w:ascii="Consolas" w:hAnsi="Consolas"/>
+        </w:rPr>
+        <w:t xml:space="preserve">    "api_name": "BadAPI",</w:t>
+      </w:r>
+    </w:p>
+    <w:p>
+      <w:r>
+        <w:rPr>
+          <w:rFonts w:ascii="Consolas" w:hAnsi="Consolas"/>
+        </w:rPr>
+        <w:t xml:space="preserve">    "response_time_ms": "3500",</w:t>
+      </w:r>
+    </w:p>
+    <w:p>
+      <w:r>
+        <w:rPr>
+          <w:rFonts w:ascii="Consolas" w:hAnsi="Consolas"/>
+        </w:rPr>
+        <w:t xml:space="preserve">    "status_code": 200,</w:t>
+      </w:r>
+    </w:p>
+    <w:p>
+      <w:r>
+        <w:rPr>
+          <w:rFonts w:ascii="Consolas" w:hAnsi="Consolas"/>
+        </w:rPr>
+        <w:t xml:space="preserve">    "records_returned": 2</w:t>
+      </w:r>
+    </w:p>
+    <w:p>
+      <w:r>
+        <w:rPr>
+          <w:rFonts w:ascii="Consolas" w:hAnsi="Consolas"/>
+        </w:rPr>
+        <w:t xml:space="preserve">  },</w:t>
+      </w:r>
+    </w:p>
+    <w:p>
+      <w:r>
+        <w:rPr>
+          <w:rFonts w:ascii="Consolas" w:hAnsi="Consolas"/>
+        </w:rPr>
+        <w:t xml:space="preserve">  {</w:t>
+      </w:r>
+    </w:p>
+    <w:p>
+      <w:r>
+        <w:rPr>
+          <w:rFonts w:ascii="Consolas" w:hAnsi="Consolas"/>
+        </w:rPr>
+        <w:t xml:space="preserve">    "api_name": "PatientDataAPI",</w:t>
+      </w:r>
+    </w:p>
+    <w:p>
+      <w:r>
+        <w:rPr>
+          <w:rFonts w:ascii="Consolas" w:hAnsi="Consolas"/>
+        </w:rPr>
+        <w:t xml:space="preserve">    "response_time_ms": 90,</w:t>
+      </w:r>
+    </w:p>
+    <w:p>
+      <w:r>
+        <w:rPr>
+          <w:rFonts w:ascii="Consolas" w:hAnsi="Consolas"/>
+        </w:rPr>
+        <w:t xml:space="preserve">    "status_code": 200,</w:t>
+      </w:r>
+    </w:p>
+    <w:p>
+      <w:r>
+        <w:rPr>
+          <w:rFonts w:ascii="Consolas" w:hAnsi="Consolas"/>
+        </w:rPr>
+        <w:t xml:space="preserve">    "patient_payload": {</w:t>
+      </w:r>
+    </w:p>
+    <w:p>
+      <w:r>
+        <w:rPr>
+          <w:rFonts w:ascii="Consolas" w:hAnsi="Consolas"/>
+        </w:rPr>
+        <w:t xml:space="preserve">      "name": "must be rejected"</w:t>
+      </w:r>
+    </w:p>
+    <w:p>
+      <w:r>
+        <w:rPr>
+          <w:rFonts w:ascii="Consolas" w:hAnsi="Consolas"/>
+        </w:rPr>
+        <w:t xml:space="preserve">    }</w:t>
+      </w:r>
+    </w:p>
+    <w:p>
+      <w:r>
+        <w:rPr>
+          <w:rFonts w:ascii="Consolas" w:hAnsi="Consolas"/>
+        </w:rPr>
+        <w:t xml:space="preserve">  }</w:t>
+      </w:r>
+    </w:p>
+    <w:p>
+      <w:r>
+        <w:rPr>
+          <w:rFonts w:ascii="Consolas" w:hAnsi="Consolas"/>
+        </w:rPr>
+        <w:t>]</w:t>
+      </w:r>
+    </w:p>
+    <w:p/>
+    <w:p>
+      <w:pPr>
+        <w:pStyle w:val="Heading2"/>
+      </w:pPr>
+      <w:r>
+        <w:t>Follow-up error report (verbatim)</w:t>
+      </w:r>
+    </w:p>
+    <w:p/>
+    <w:p>
+      <w:r>
+        <w:rPr>
+          <w:rFonts w:ascii="Consolas" w:hAnsi="Consolas"/>
+        </w:rPr>
+        <w:t>Origin is not allowed</w:t>
+      </w:r>
+    </w:p>
+    <w:p>
+      <w:r>
+        <w:rPr>
+          <w:rFonts w:ascii="Consolas" w:hAnsi="Consolas"/>
+        </w:rPr>
+        <w:t>Request ID: af29e90c-0209-4477-a3a5-384fdb5e87a1</w:t>
+      </w:r>
+    </w:p>
+    <w:p/>
+    <w:p>
+      <w:pPr>
+        <w:pStyle w:val="Heading2"/>
+      </w:pPr>
+      <w:r>
+        <w:t>Follow-up prompt: rule-based fallback (verbatim)</w:t>
+      </w:r>
+    </w:p>
+    <w:p/>
+    <w:p>
+      <w:r>
+        <w:rPr>
+          <w:rFonts w:ascii="Consolas" w:hAnsi="Consolas"/>
+        </w:rPr>
+        <w:t>do not make llm model fallback make rule-base explation fallback</w:t>
+      </w:r>
+    </w:p>
+    <w:p/>
+    <w:p>
+      <w:pPr>
+        <w:pStyle w:val="Heading2"/>
+      </w:pPr>
+      <w:r>
+        <w:t>Follow-up prompt: asynchronous explanation design (verbatim)</w:t>
+      </w:r>
+    </w:p>
+    <w:p/>
+    <w:p>
+      <w:r>
+        <w:rPr>
+          <w:rFonts w:ascii="Consolas" w:hAnsi="Consolas"/>
+        </w:rPr>
+        <w:t>if system find any severity like critical and warnign if fast llm to explain if llm fail rule base as fall back also this task will backgroud task so that post not wait for post respone : for betterment give design for this</w:t>
+      </w:r>
+    </w:p>
+    <w:p/>
+    <w:p>
+      <w:pPr>
+        <w:pStyle w:val="Heading2"/>
+      </w:pPr>
+      <w:r>
+        <w:t>Follow-up prompt: diagram (verbatim)</w:t>
+      </w:r>
+    </w:p>
+    <w:p/>
+    <w:p>
+      <w:r>
+        <w:rPr>
+          <w:rFonts w:ascii="Consolas" w:hAnsi="Consolas"/>
+        </w:rPr>
+        <w:t>can explain me uiing diagram</w:t>
+      </w:r>
+    </w:p>
+    <w:p/>
+    <w:p>
+      <w:pPr>
+        <w:pStyle w:val="Heading2"/>
+      </w:pPr>
+      <w:r>
+        <w:t>Follow-up prompt: implementation (verbatim)</w:t>
+      </w:r>
+    </w:p>
+    <w:p/>
+    <w:p>
+      <w:r>
+        <w:rPr>
+          <w:rFonts w:ascii="Consolas" w:hAnsi="Consolas"/>
+        </w:rPr>
+        <w:t>Implement the plan.</w:t>
+      </w:r>
+    </w:p>
+    <w:p/>
+    <w:p>
+      <w:pPr>
+        <w:pStyle w:val="Heading2"/>
+      </w:pPr>
+      <w:r>
+        <w:t>Follow-up prompt: end-to-end test (verbatim)</w:t>
+      </w:r>
+    </w:p>
+    <w:p/>
+    <w:p>
+      <w:r>
+        <w:rPr>
+          <w:rFonts w:ascii="Consolas" w:hAnsi="Consolas"/>
+        </w:rPr>
+        <w:t>do a e2e test</w:t>
+      </w:r>
+    </w:p>
+    <w:p/>
+    <w:p>
+      <w:pPr>
+        <w:pStyle w:val="Heading2"/>
+      </w:pPr>
+      <w:r>
+        <w:t>Follow-up prompt: live asynchronous LLM check (verbatim)</w:t>
+      </w:r>
+    </w:p>
+    <w:p/>
+    <w:p>
+      <w:r>
+        <w:rPr>
+          <w:rFonts w:ascii="Consolas" w:hAnsi="Consolas"/>
+        </w:rPr>
+        <w:t>does you test llm actually call later and everything work properly</w:t>
       </w:r>
     </w:p>
     <w:sectPr>

</xml_diff>